<commit_message>
updated Slippage model GUI User Guide text to align with what is seen in GUI
</commit_message>
<xml_diff>
--- a/docs/Slippage_Model_GUI_User_Guide.docx
+++ b/docs/Slippage_Model_GUI_User_Guide.docx
@@ -282,6 +282,20 @@
           <w:color w:val="7030A0"/>
         </w:rPr>
         <w:t>“</w:t>
+      </w:r>
+      <w:proofErr w:type="spellStart"/>
+      <w:r>
+        <w:rPr>
+          <w:color w:val="7030A0"/>
+        </w:rPr>
+        <w:t>gui</w:t>
+      </w:r>
+      <w:proofErr w:type="spellEnd"/>
+      <w:r>
+        <w:rPr>
+          <w:color w:val="7030A0"/>
+        </w:rPr>
+        <w:t>/</w:t>
       </w:r>
       <w:proofErr w:type="spellStart"/>
       <w:r>
@@ -1306,7 +1320,10 @@
         <w:t>”</w:t>
       </w:r>
       <w:r>
-        <w:t xml:space="preserve">, </w:t>
+        <w:t xml:space="preserve"> and</w:t>
+      </w:r>
+      <w:r>
+        <w:t xml:space="preserve"> </w:t>
       </w:r>
       <w:r>
         <w:t xml:space="preserve">select </w:t>
@@ -1339,19 +1356,6 @@
       </w:r>
       <w:r>
         <w:t>’</w:t>
-      </w:r>
-      <w:r>
-        <w:t xml:space="preserve">, and </w:t>
-      </w:r>
-      <w:r>
-        <w:rPr>
-          <w:b/>
-          <w:bCs/>
-        </w:rPr>
-        <w:t>uncheck the box</w:t>
-      </w:r>
-      <w:r>
-        <w:t xml:space="preserve"> for using producer grouping</w:t>
       </w:r>
       <w:r>
         <w:t xml:space="preserve">. </w:t>
@@ -1954,7 +1958,13 @@
         <w:t>R</w:t>
       </w:r>
       <w:r>
-        <w:t>ate”</w:t>
+        <w:t>ate</w:t>
+      </w:r>
+      <w:r>
+        <w:t xml:space="preserve"> (at lowest unit level)</w:t>
+      </w:r>
+      <w:r>
+        <w:t>”</w:t>
       </w:r>
       <w:r>
         <w:t>.</w:t>
@@ -2662,16 +2672,25 @@
         <w:t>Page 3 – Inspection Process</w:t>
       </w:r>
       <w:r>
-        <w:t>” and confirm the “</w:t>
-      </w:r>
-      <w:r>
-        <w:rPr>
-          <w:u w:val="single"/>
-        </w:rPr>
-        <w:t>Upload tables</w:t>
-      </w:r>
-      <w:r>
-        <w:t>” tab is active.</w:t>
+        <w:t xml:space="preserve">” and </w:t>
+      </w:r>
+      <w:r>
+        <w:t>click on</w:t>
+      </w:r>
+      <w:r>
+        <w:t xml:space="preserve"> the “</w:t>
+      </w:r>
+      <w:r>
+        <w:t xml:space="preserve">Upload </w:t>
+      </w:r>
+      <w:r>
+        <w:t>T</w:t>
+      </w:r>
+      <w:r>
+        <w:t>able</w:t>
+      </w:r>
+      <w:r>
+        <w:t>” tab.</w:t>
       </w:r>
     </w:p>
     <w:p>
@@ -3202,10 +3221,13 @@
         <w:t>” then the “</w:t>
       </w:r>
       <w:r>
-        <w:rPr>
-          <w:u w:val="single"/>
-        </w:rPr>
-        <w:t>Build experiments</w:t>
+        <w:t xml:space="preserve">Build </w:t>
+      </w:r>
+      <w:r>
+        <w:t>E</w:t>
+      </w:r>
+      <w:r>
+        <w:t>xperiments</w:t>
       </w:r>
       <w:r>
         <w:t>” tab</w:t>
@@ -3943,7 +3965,19 @@
         <w:ind w:left="1080"/>
       </w:pPr>
       <w:r>
-        <w:t xml:space="preserve">Increase the number of simulation replications to three (3). </w:t>
+        <w:t xml:space="preserve">Increase the number of simulation replications to </w:t>
+      </w:r>
+      <w:r>
+        <w:t>five</w:t>
+      </w:r>
+      <w:r>
+        <w:t xml:space="preserve"> (</w:t>
+      </w:r>
+      <w:r>
+        <w:t>5</w:t>
+      </w:r>
+      <w:r>
+        <w:t xml:space="preserve">). </w:t>
       </w:r>
     </w:p>
     <w:p>

</xml_diff>